<commit_message>
Doc: APA 7th Edition References
- Reference style set as APA 7th Edition to abide by APJITM requirements.

TODO List:
- Verification of the details in the Data Extraction sheet manually
- Notably, verifying the datasets manually and ensuring that ones such as "Brain Tumor Classification (MRI)", "Brain Tumor MRI Dataset", "Public MRI brain tumor dataset" either have their dataset/relevant paper hyperlinked or stated clearly (since the names are vague)
- The Secondary & Tertiary Review additions from the Screening Ledger to the E:H columns (in Data Extraction)
</commit_message>
<xml_diff>
--- a/WIP/SLR.docx
+++ b/WIP/SLR.docx
@@ -158,7 +158,21 @@
           <w:sz w:val="18"/>
           <w:szCs w:val="18"/>
         </w:rPr>
-        <w:t>The Zhi Wei</w:t>
+        <w:t>T</w:t>
+      </w:r>
+      <w:r>
+        <w:rPr>
+          <w:sz w:val="18"/>
+          <w:szCs w:val="18"/>
+        </w:rPr>
+        <w:t>eh</w:t>
+      </w:r>
+      <w:r>
+        <w:rPr>
+          <w:sz w:val="18"/>
+          <w:szCs w:val="18"/>
+        </w:rPr>
+        <w:t xml:space="preserve"> Zhi Wei</w:t>
       </w:r>
       <w:r>
         <w:rPr>

</xml_diff>